<commit_message>
Add Claude Chat subscription to architecture budget.
Include 100 USD per month for claude.ai separately from Anthropic API; update monthly and project totals to 360-460 and 3-4k.

Co-authored-by: Cursor <cursoragent@cursor.com>
</commit_message>
<xml_diff>
--- a/GRC → US — техархитектура и подписки.docx
+++ b/GRC → US — техархитектура и подписки.docx
@@ -1047,7 +1047,7 @@
       <w:tr>
         <w:tc>
           <w:tcPr>
-            <w:tcW w:type="dxa" w:w="1872"/>
+            <w:tcW w:type="dxa" w:w="1728"/>
             <w:shd w:fill="0F172A" w:val="clear"/>
           </w:tcPr>
           <w:p>
@@ -1064,7 +1064,7 @@
         </w:tc>
         <w:tc>
           <w:tcPr>
-            <w:tcW w:type="dxa" w:w="3600"/>
+            <w:tcW w:type="dxa" w:w="3456"/>
             <w:shd w:fill="0F172A" w:val="clear"/>
           </w:tcPr>
           <w:p>
@@ -1100,7 +1100,7 @@
       <w:tr>
         <w:tc>
           <w:tcPr>
-            <w:tcW w:type="dxa" w:w="1872"/>
+            <w:tcW w:type="dxa" w:w="1728"/>
             <w:shd w:fill="FFFFFF" w:val="clear"/>
           </w:tcPr>
           <w:p>
@@ -1115,7 +1115,7 @@
         </w:tc>
         <w:tc>
           <w:tcPr>
-            <w:tcW w:type="dxa" w:w="3600"/>
+            <w:tcW w:type="dxa" w:w="3456"/>
             <w:shd w:fill="FFFFFF" w:val="clear"/>
           </w:tcPr>
           <w:p>
@@ -1147,7 +1147,7 @@
       <w:tr>
         <w:tc>
           <w:tcPr>
-            <w:tcW w:type="dxa" w:w="1872"/>
+            <w:tcW w:type="dxa" w:w="1728"/>
             <w:shd w:fill="F8FAFC" w:val="clear"/>
           </w:tcPr>
           <w:p>
@@ -1162,7 +1162,7 @@
         </w:tc>
         <w:tc>
           <w:tcPr>
-            <w:tcW w:type="dxa" w:w="3600"/>
+            <w:tcW w:type="dxa" w:w="3456"/>
             <w:shd w:fill="F8FAFC" w:val="clear"/>
           </w:tcPr>
           <w:p>
@@ -1194,7 +1194,7 @@
       <w:tr>
         <w:tc>
           <w:tcPr>
-            <w:tcW w:type="dxa" w:w="1872"/>
+            <w:tcW w:type="dxa" w:w="1728"/>
             <w:shd w:fill="FFFFFF" w:val="clear"/>
           </w:tcPr>
           <w:p>
@@ -1209,7 +1209,7 @@
         </w:tc>
         <w:tc>
           <w:tcPr>
-            <w:tcW w:type="dxa" w:w="3600"/>
+            <w:tcW w:type="dxa" w:w="3456"/>
             <w:shd w:fill="FFFFFF" w:val="clear"/>
           </w:tcPr>
           <w:p>
@@ -1241,8 +1241,55 @@
       <w:tr>
         <w:tc>
           <w:tcPr>
-            <w:tcW w:type="dxa" w:w="1872"/>
+            <w:tcW w:type="dxa" w:w="1728"/>
             <w:shd w:fill="F8FAFC" w:val="clear"/>
+          </w:tcPr>
+          <w:p>
+            <w:r>
+              <w:rPr>
+                <w:rFonts w:ascii="Calibri" w:hAnsi="Calibri"/>
+                <w:sz w:val="20"/>
+              </w:rPr>
+              <w:t>Claude (Chat)</w:t>
+            </w:r>
+          </w:p>
+        </w:tc>
+        <w:tc>
+          <w:tcPr>
+            <w:tcW w:type="dxa" w:w="3456"/>
+            <w:shd w:fill="F8FAFC" w:val="clear"/>
+          </w:tcPr>
+          <w:p>
+            <w:r>
+              <w:rPr>
+                <w:rFonts w:ascii="Calibri" w:hAnsi="Calibri"/>
+                <w:sz w:val="20"/>
+              </w:rPr>
+              <w:t>Подписка claude.ai, отдельно от API</w:t>
+            </w:r>
+          </w:p>
+        </w:tc>
+        <w:tc>
+          <w:tcPr>
+            <w:tcW w:type="dxa" w:w="1440"/>
+            <w:shd w:fill="F8FAFC" w:val="clear"/>
+          </w:tcPr>
+          <w:p>
+            <w:r>
+              <w:rPr>
+                <w:rFonts w:ascii="Calibri" w:hAnsi="Calibri"/>
+                <w:sz w:val="20"/>
+              </w:rPr>
+              <w:t>100</w:t>
+            </w:r>
+          </w:p>
+        </w:tc>
+      </w:tr>
+      <w:tr>
+        <w:tc>
+          <w:tcPr>
+            <w:tcW w:type="dxa" w:w="1728"/>
+            <w:shd w:fill="FFFFFF" w:val="clear"/>
           </w:tcPr>
           <w:p>
             <w:r>
@@ -1256,8 +1303,8 @@
         </w:tc>
         <w:tc>
           <w:tcPr>
-            <w:tcW w:type="dxa" w:w="3600"/>
-            <w:shd w:fill="F8FAFC" w:val="clear"/>
+            <w:tcW w:type="dxa" w:w="3456"/>
+            <w:shd w:fill="FFFFFF" w:val="clear"/>
           </w:tcPr>
           <w:p>
             <w:r>
@@ -1272,7 +1319,7 @@
         <w:tc>
           <w:tcPr>
             <w:tcW w:type="dxa" w:w="1440"/>
-            <w:shd w:fill="F8FAFC" w:val="clear"/>
+            <w:shd w:fill="FFFFFF" w:val="clear"/>
           </w:tcPr>
           <w:p>
             <w:r>
@@ -1288,8 +1335,8 @@
       <w:tr>
         <w:tc>
           <w:tcPr>
-            <w:tcW w:type="dxa" w:w="1872"/>
-            <w:shd w:fill="FFFFFF" w:val="clear"/>
+            <w:tcW w:type="dxa" w:w="1728"/>
+            <w:shd w:fill="F8FAFC" w:val="clear"/>
           </w:tcPr>
           <w:p>
             <w:r>
@@ -1303,8 +1350,8 @@
         </w:tc>
         <w:tc>
           <w:tcPr>
-            <w:tcW w:type="dxa" w:w="3600"/>
-            <w:shd w:fill="FFFFFF" w:val="clear"/>
+            <w:tcW w:type="dxa" w:w="3456"/>
+            <w:shd w:fill="F8FAFC" w:val="clear"/>
           </w:tcPr>
           <w:p>
             <w:r>
@@ -1318,7 +1365,7 @@
         <w:tc>
           <w:tcPr>
             <w:tcW w:type="dxa" w:w="1440"/>
-            <w:shd w:fill="FFFFFF" w:val="clear"/>
+            <w:shd w:fill="F8FAFC" w:val="clear"/>
           </w:tcPr>
           <w:p>
             <w:r>
@@ -1326,7 +1373,7 @@
                 <w:rFonts w:ascii="Calibri" w:hAnsi="Calibri"/>
                 <w:sz w:val="20"/>
               </w:rPr>
-              <w:t>260–360</w:t>
+              <w:t>360–460</w:t>
             </w:r>
           </w:p>
         </w:tc>
@@ -1343,7 +1390,7 @@
           <w:color w:val="334155"/>
           <w:sz w:val="20"/>
         </w:rPr>
-        <w:t>Рекомендуем планировать: ~$300/мес (Vercel ~$150).</w:t>
+        <w:t>Рекомендуем планировать: ~$400/мес (Vercel ~$150, Claude Chat $100).</w:t>
       </w:r>
     </w:p>
     <w:p>
@@ -1468,7 +1515,7 @@
                 <w:rFonts w:ascii="Calibri" w:hAnsi="Calibri"/>
                 <w:sz w:val="20"/>
               </w:rPr>
-              <w:t>260</w:t>
+              <w:t>360</w:t>
             </w:r>
           </w:p>
         </w:tc>
@@ -1498,7 +1545,7 @@
                 <w:rFonts w:ascii="Calibri" w:hAnsi="Calibri"/>
                 <w:sz w:val="20"/>
               </w:rPr>
-              <w:t>~2 080</w:t>
+              <w:t>~2 880</w:t>
             </w:r>
           </w:p>
         </w:tc>
@@ -1530,7 +1577,7 @@
                 <w:rFonts w:ascii="Calibri" w:hAnsi="Calibri"/>
                 <w:sz w:val="20"/>
               </w:rPr>
-              <w:t>310</w:t>
+              <w:t>410</w:t>
             </w:r>
           </w:p>
         </w:tc>
@@ -1560,7 +1607,7 @@
                 <w:rFonts w:ascii="Calibri" w:hAnsi="Calibri"/>
                 <w:sz w:val="20"/>
               </w:rPr>
-              <w:t>~2 480</w:t>
+              <w:t>~3 280</w:t>
             </w:r>
           </w:p>
         </w:tc>
@@ -1592,7 +1639,7 @@
                 <w:rFonts w:ascii="Calibri" w:hAnsi="Calibri"/>
                 <w:sz w:val="20"/>
               </w:rPr>
-              <w:t>360</w:t>
+              <w:t>460</w:t>
             </w:r>
           </w:p>
         </w:tc>
@@ -1622,7 +1669,7 @@
                 <w:rFonts w:ascii="Calibri" w:hAnsi="Calibri"/>
                 <w:sz w:val="20"/>
               </w:rPr>
-              <w:t>~3 240</w:t>
+              <w:t>~4 140</w:t>
             </w:r>
           </w:p>
         </w:tc>
@@ -1639,7 +1686,7 @@
           <w:color w:val="334155"/>
           <w:sz w:val="20"/>
         </w:rPr>
-        <w:t>Ориентир: ~$2 500–3 000 на подписки за полный цикл.</w:t>
+        <w:t>Ориентир: ~$3 000–4 000 на подписки за полный цикл.</w:t>
       </w:r>
     </w:p>
     <w:p>
@@ -1822,7 +1869,7 @@
                 <w:rFonts w:ascii="Calibri" w:hAnsi="Calibri"/>
                 <w:sz w:val="20"/>
               </w:rPr>
-              <w:t>Cursor, OpenAI, Anthropic</w:t>
+              <w:t>Cursor, OpenAI/Anthropic API, Claude Chat</w:t>
             </w:r>
           </w:p>
         </w:tc>
@@ -2067,7 +2114,7 @@
                 <w:rFonts w:ascii="Calibri" w:hAnsi="Calibri"/>
                 <w:sz w:val="20"/>
               </w:rPr>
-              <w:t>~$2 500–3 000</w:t>
+              <w:t>~$3 000–4 000</w:t>
             </w:r>
           </w:p>
         </w:tc>
@@ -2160,7 +2207,7 @@
           <w:color w:val="334155"/>
           <w:sz w:val="20"/>
         </w:rPr>
-        <w:t>Вы каждый месяц: Cursor $60 + OpenAI ≥$50 + Anthropic ≥$50 + Vercel $100–200 = $260–360. За проект на подписки: ~$2 500–3 000. GRC платит prod-инфраструктуру отдельно. Ваш гонорар $43 000 — отдельно от их Twilio/CRM.</w:t>
+        <w:t>Вы каждый месяц: Cursor $60 + OpenAI API ≥$50 + Anthropic API ≥$50 + Claude Chat $100 + Vercel $100–200 = $360–460. За проект на подписки: ~$3 000–4 000. GRC платит prod отдельно. Ваш гонорар $43 000 — отдельно от их Twilio/CRM.</w:t>
       </w:r>
     </w:p>
     <w:p>

</xml_diff>